<commit_message>
Geschichte 8: Texte im Blocksatz, Zeitstrahl-Blatt zu den Generalständen
Co-Authored-By: Claude Sonnet 5.5 <noreply@anthropic.com>
Claude-Session: https://claude.ai/code/session_01CtRuNVyt8v9M882BKEmgNb
</commit_message>
<xml_diff>
--- a/Geschichte_8/Franzoesische_Revolution/Expertentexte_Franzoesische_Revolution.docx
+++ b/Geschichte_8/Franzoesische_Revolution/Expertentexte_Franzoesische_Revolution.docx
@@ -53,6 +53,7 @@
     <w:p>
       <w:pPr>
         <w:spacing w:after="140" w:before="0" w:line="330"/>
+        <w:jc w:val="both"/>
       </w:pPr>
       <w:r>
         <w:rPr>
@@ -67,6 +68,7 @@
     <w:p>
       <w:pPr>
         <w:spacing w:after="140" w:before="0" w:line="330"/>
+        <w:jc w:val="both"/>
       </w:pPr>
       <w:r>
         <w:rPr>
@@ -81,6 +83,7 @@
     <w:p>
       <w:pPr>
         <w:spacing w:after="140" w:before="0" w:line="330"/>
+        <w:jc w:val="both"/>
       </w:pPr>
       <w:r>
         <w:rPr>
@@ -405,6 +408,7 @@
     <w:p>
       <w:pPr>
         <w:spacing w:after="140" w:before="0" w:line="330"/>
+        <w:jc w:val="both"/>
       </w:pPr>
       <w:r>
         <w:rPr>
@@ -419,6 +423,7 @@
     <w:p>
       <w:pPr>
         <w:spacing w:after="140" w:before="0" w:line="330"/>
+        <w:jc w:val="both"/>
       </w:pPr>
       <w:r>
         <w:rPr>
@@ -433,6 +438,7 @@
     <w:p>
       <w:pPr>
         <w:spacing w:after="140" w:before="0" w:line="330"/>
+        <w:jc w:val="both"/>
       </w:pPr>
       <w:r>
         <w:rPr>
@@ -757,6 +763,7 @@
     <w:p>
       <w:pPr>
         <w:spacing w:after="140" w:before="0" w:line="330"/>
+        <w:jc w:val="both"/>
       </w:pPr>
       <w:r>
         <w:rPr>
@@ -771,6 +778,7 @@
     <w:p>
       <w:pPr>
         <w:spacing w:after="140" w:before="0" w:line="330"/>
+        <w:jc w:val="both"/>
       </w:pPr>
       <w:r>
         <w:rPr>
@@ -785,6 +793,7 @@
     <w:p>
       <w:pPr>
         <w:spacing w:after="140" w:before="0" w:line="330"/>
+        <w:jc w:val="both"/>
       </w:pPr>
       <w:r>
         <w:rPr>

</xml_diff>